<commit_message>
Update model doc to bus_stop_mean_dist version
Co-Authored-By: PiyaphatC <piyaphat.civilcu@gmail.com>
</commit_message>
<xml_diff>
--- a/Output/model_explanation_TH_updated.docx
+++ b/Output/model_explanation_TH_updated.docx
@@ -8,7 +8,7 @@
         <w:rPr>
           <w:b/>
         </w:rPr>
-        <w:t>แบบจำลองการถดถอยสำหรับการพยากรณ์จำนวนผู้โดยสาร BTS/MRT กรุงเทพฯ (ฉบับ rev10)</w:t>
+        <w:t>แบบจำลองการถดถอยสำหรับการพยากรณ์จำนวนผู้โดยสาร BTS/MRT กรุงเทพฯ (ฉบับ rev10 — bus_stop_mean_dist)</w:t>
       </w:r>
     </w:p>
     <w:p>
@@ -62,7 +62,7 @@
         <w:rPr>
           <w:b w:val="0"/>
         </w:rPr>
-        <w:t>แบบจำลองนี้ใช้ OLS แบบ Log-Log เพื่อประมาณค่าความยืดหยุ่นของจำนวนผู้โดยสารสถานีรถไฟฟ้า ครอบคลุมสถานี BTS และ MRT ในกรุงเทพมหานครทั้งหมด 193 สถานี ได้ค่า R² = 0.4329 และ Adjusted R² = 0.4114 ตัวแปรอิสระแบ่งออกเป็นสองกลุ่ม ได้แก่ (1) ตัวแปรคุณภาพทางเดินเท้า 3 มิติ ได้แก่ พื้นผิว (Surface) ร่มเงา (Shade) และความปลอดภัยจากสิ่งกีดขวาง (Obstacle-free) และ (2) ตัวแปรระบบขนส่งเชื่อมต่อ ได้แก่ วินมอเตอร์ไซค์ จักรยานสาธารณะ แท็กซี่ และระยะทางถึงป้ายรถเมล์</w:t>
+        <w:t>แบบจำลองนี้ใช้ OLS แบบ Log-Log เพื่อประมาณค่าความยืดหยุ่นของจำนวนผู้โดยสารสถานีรถไฟฟ้า ครอบคลุมสถานี BTS และ MRT ในกรุงเทพมหานครทั้งหมด 193 สถานี ได้ค่า R² = 0.4328 และ Adjusted R² = 0.4114 ตัวแปรอิสระแบ่งออกเป็นสองกลุ่ม ได้แก่ (1) ตัวแปรคุณภาพทางเดินเท้า 3 มิติ ได้แก่ พื้นผิว (Surface) ร่มเงา (Shade) และความปลอดภัยจากสิ่งกีดขวาง (Obstacle-free) และ (2) ตัวแปรระบบขนส่งเชื่อมต่อ ได้แก่ วินมอเตอร์ไซค์ จักรยานสาธารณะ แท็กซี่ และระยะทางเฉลี่ยถึงป้ายรถเมล์</w:t>
       </w:r>
     </w:p>
     <w:tbl>
@@ -114,7 +114,7 @@
           </w:tcPr>
           <w:p>
             <w:r>
-              <w:t>0.4329</w:t>
+              <w:t>0.4328</w:t>
             </w:r>
           </w:p>
         </w:tc>
@@ -158,7 +158,7 @@
           </w:tcPr>
           <w:p>
             <w:r>
-              <w:t>32.73</w:t>
+              <w:t>32.72</w:t>
             </w:r>
           </w:p>
         </w:tc>
@@ -278,7 +278,7 @@
         <w:rPr>
           <w:b w:val="0"/>
         </w:rPr>
-        <w:t>log(Ridership + 1)  =  +6.1797  ***</w:t>
+        <w:t>log(Ridership + 1)  =  +6.2200  ***  (p &lt; 0.001)</w:t>
       </w:r>
     </w:p>
     <w:p>
@@ -287,7 +287,7 @@
         <w:rPr>
           <w:b w:val="0"/>
         </w:rPr>
-        <w:t xml:space="preserve">  +  0.1659  · log(surface_pct_1 + 1)     .</w:t>
+        <w:t xml:space="preserve">  +  0.1771  · log(surface_pct_1 + 1)       .  (p = 0.058)</w:t>
       </w:r>
     </w:p>
     <w:p>
@@ -296,7 +296,7 @@
         <w:rPr>
           <w:b w:val="0"/>
         </w:rPr>
-        <w:t xml:space="preserve">  +  0.0519  · log(shade_pct_1 + 1)</w:t>
+        <w:t xml:space="preserve">  +  0.0501  · log(shade_pct_1 + 1)             (p = 0.302)</w:t>
       </w:r>
     </w:p>
     <w:p>
@@ -305,7 +305,7 @@
         <w:rPr>
           <w:b w:val="0"/>
         </w:rPr>
-        <w:t xml:space="preserve">  +  0.0608  · log(obs_pct_1 + 1)</w:t>
+        <w:t xml:space="preserve">  +  0.0529  · log(obs_pct_1 + 1)               (p = 0.489)</w:t>
       </w:r>
     </w:p>
     <w:p>
@@ -314,7 +314,7 @@
         <w:rPr>
           <w:b w:val="0"/>
         </w:rPr>
-        <w:t xml:space="preserve">  +  0.5547  · log(win_count + 1)          ***</w:t>
+        <w:t xml:space="preserve">  +  0.5710  · log(win_count + 1)          ***  (p &lt; 0.001)</w:t>
       </w:r>
     </w:p>
     <w:p>
@@ -323,7 +323,7 @@
         <w:rPr>
           <w:b w:val="0"/>
         </w:rPr>
-        <w:t xml:space="preserve">  +  0.6217  · log(bike_share_count + 1)   ***</w:t>
+        <w:t xml:space="preserve">  +  0.6215  · log(bike_share_count + 1)   ***  (p &lt; 0.001)</w:t>
       </w:r>
     </w:p>
     <w:p>
@@ -332,7 +332,7 @@
         <w:rPr>
           <w:b w:val="0"/>
         </w:rPr>
-        <w:t xml:space="preserve">  +  0.5963  · log(taxi_count + 1)         ***</w:t>
+        <w:t xml:space="preserve">  +  0.6037  · log(taxi_count + 1)         ***  (p &lt; 0.001)</w:t>
       </w:r>
     </w:p>
     <w:p>
@@ -341,7 +341,7 @@
         <w:rPr>
           <w:b w:val="0"/>
         </w:rPr>
-        <w:t xml:space="preserve">  −  0.0470  · log(bus_stop_min_dist + 1)</w:t>
+        <w:t xml:space="preserve">  −  0.0557  · log(bus_stop_mean_dist + 1)      (p = 0.289)</w:t>
       </w:r>
     </w:p>
     <w:p>
@@ -464,7 +464,7 @@
           </w:tcPr>
           <w:p>
             <w:r>
-              <w:t>+0.1659</w:t>
+              <w:t>+0.1771</w:t>
             </w:r>
           </w:p>
         </w:tc>
@@ -474,7 +474,7 @@
           </w:tcPr>
           <w:p>
             <w:r>
-              <w:t>0.069 .</w:t>
+              <w:t>0.058 .</w:t>
             </w:r>
           </w:p>
         </w:tc>
@@ -516,7 +516,7 @@
           </w:tcPr>
           <w:p>
             <w:r>
-              <w:t>+0.0519</w:t>
+              <w:t>+0.0501</w:t>
             </w:r>
           </w:p>
         </w:tc>
@@ -526,7 +526,7 @@
           </w:tcPr>
           <w:p>
             <w:r>
-              <w:t>0.288</w:t>
+              <w:t>0.302</w:t>
             </w:r>
           </w:p>
         </w:tc>
@@ -568,7 +568,7 @@
           </w:tcPr>
           <w:p>
             <w:r>
-              <w:t>+0.0608</w:t>
+              <w:t>+0.0529</w:t>
             </w:r>
           </w:p>
         </w:tc>
@@ -578,7 +578,7 @@
           </w:tcPr>
           <w:p>
             <w:r>
-              <w:t>0.426</w:t>
+              <w:t>0.489</w:t>
             </w:r>
           </w:p>
         </w:tc>
@@ -620,7 +620,7 @@
           </w:tcPr>
           <w:p>
             <w:r>
-              <w:t>+0.5547</w:t>
+              <w:t>+0.5710</w:t>
             </w:r>
           </w:p>
         </w:tc>
@@ -672,7 +672,7 @@
           </w:tcPr>
           <w:p>
             <w:r>
-              <w:t>+0.6217</w:t>
+              <w:t>+0.6215</w:t>
             </w:r>
           </w:p>
         </w:tc>
@@ -724,7 +724,7 @@
           </w:tcPr>
           <w:p>
             <w:r>
-              <w:t>+0.5963</w:t>
+              <w:t>+0.6037</w:t>
             </w:r>
           </w:p>
         </w:tc>
@@ -746,7 +746,7 @@
           </w:tcPr>
           <w:p>
             <w:r>
-              <w:t>bus_stop_min_dist</w:t>
+              <w:t>bus_stop_mean_dist</w:t>
             </w:r>
           </w:p>
         </w:tc>
@@ -756,7 +756,7 @@
           </w:tcPr>
           <w:p>
             <w:r>
-              <w:t>ระยะทางต่ำสุดถึงป้ายรถประจำทาง</w:t>
+              <w:t>ระยะทางเฉลี่ยถึงป้ายรถประจำทาง</w:t>
             </w:r>
           </w:p>
         </w:tc>
@@ -776,7 +776,7 @@
           </w:tcPr>
           <w:p>
             <w:r>
-              <w:t>−0.0470</w:t>
+              <w:t>−0.0557</w:t>
             </w:r>
           </w:p>
         </w:tc>
@@ -786,7 +786,7 @@
           </w:tcPr>
           <w:p>
             <w:r>
-              <w:t>0.299</w:t>
+              <w:t>0.289</w:t>
             </w:r>
           </w:p>
         </w:tc>
@@ -831,15 +831,7 @@
         <w:pStyle w:val="ListBullet"/>
       </w:pPr>
       <w:r>
-        <w:t>surface_pct_1 มีค่าเท่ากับ sidewalk_length_surface_1 / sw_total_length × 100 ทางคณิตศาสตร์ (r = 1.000) จึงเป็นตัวแทนมิติเดียวกัน ไม่ควรใส่ทั้งสองพร้อมกันในแบบจำลอง</w:t>
-      </w:r>
-    </w:p>
-    <w:p>
-      <w:pPr>
-        <w:pStyle w:val="ListBullet"/>
-      </w:pPr>
-      <w:r>
-        <w:t>bus_stop_min_dist มีเครื่องหมายลบ หมายความว่า สถานีที่อยู่ใกล้ป้ายรถเมล์มีผู้โดยสารมากกว่า (ใกล้กว่า = ดีกว่า)</w:t>
+        <w:t>bus_stop_mean_dist มีเครื่องหมายลบ หมายความว่า สถานีที่อยู่ใกล้ป้ายรถเมล์โดยเฉลี่ยมีผู้โดยสารมากกว่า (ใกล้กว่า = ดีกว่า)</w:t>
       </w:r>
     </w:p>
     <w:p>

</xml_diff>